<commit_message>
big commit almost finished
I think i finished everything for submission. i am just preparing the last things
</commit_message>
<xml_diff>
--- a/ACW1-SandboxTool/User Manual.docx
+++ b/ACW1-SandboxTool/User Manual.docx
@@ -196,8 +196,18 @@
     <w:p>
       <w:pPr>
         <w:pStyle w:val="Heading1"/>
-      </w:pPr>
-      <w:r>
+        <w:rPr>
+          <w:rFonts w:asciiTheme="minorHAnsi" w:hAnsiTheme="minorHAnsi"/>
+          <w:sz w:val="24"/>
+          <w:szCs w:val="24"/>
+        </w:rPr>
+      </w:pPr>
+      <w:r>
+        <w:rPr>
+          <w:rFonts w:asciiTheme="minorHAnsi" w:hAnsiTheme="minorHAnsi"/>
+          <w:sz w:val="24"/>
+          <w:szCs w:val="24"/>
+        </w:rPr>
         <w:t>1.Purpose</w:t>
       </w:r>
     </w:p>
@@ -244,8 +254,13 @@
       <w:r>
         <w:t xml:space="preserve">Launches Windows Sandbox automatically using a </w:t>
       </w:r>
-      <w:r>
-        <w:t>generated  .wsb</w:t>
+      <w:proofErr w:type="gramStart"/>
+      <w:r>
+        <w:t>generated  .</w:t>
+      </w:r>
+      <w:proofErr w:type="gramEnd"/>
+      <w:r>
+        <w:t>wsb</w:t>
       </w:r>
       <w:r>
         <w:t xml:space="preserve"> configuration file.</w:t>
@@ -664,8 +679,18 @@
     <w:p>
       <w:pPr>
         <w:pStyle w:val="Heading1"/>
-      </w:pPr>
-      <w:r>
+        <w:rPr>
+          <w:rFonts w:asciiTheme="minorHAnsi" w:hAnsiTheme="minorHAnsi"/>
+          <w:sz w:val="24"/>
+          <w:szCs w:val="24"/>
+        </w:rPr>
+      </w:pPr>
+      <w:r>
+        <w:rPr>
+          <w:rFonts w:asciiTheme="minorHAnsi" w:hAnsiTheme="minorHAnsi"/>
+          <w:sz w:val="24"/>
+          <w:szCs w:val="24"/>
+        </w:rPr>
         <w:t>2. Installation and Project Structure</w:t>
       </w:r>
     </w:p>
@@ -1201,8 +1226,18 @@
     <w:p>
       <w:pPr>
         <w:pStyle w:val="Heading1"/>
-      </w:pPr>
-      <w:r>
+        <w:rPr>
+          <w:rFonts w:asciiTheme="minorHAnsi" w:hAnsiTheme="minorHAnsi"/>
+          <w:sz w:val="24"/>
+          <w:szCs w:val="24"/>
+        </w:rPr>
+      </w:pPr>
+      <w:r>
+        <w:rPr>
+          <w:rFonts w:asciiTheme="minorHAnsi" w:hAnsiTheme="minorHAnsi"/>
+          <w:sz w:val="24"/>
+          <w:szCs w:val="24"/>
+        </w:rPr>
         <w:t>3. Running the Tool</w:t>
       </w:r>
     </w:p>
@@ -1650,16 +1685,20 @@
         <w:spacing w:after="0"/>
       </w:pPr>
       <w:r>
-        <w:t>After the Sandbox finishes execution and is closed, the output file will be created in the same folder as the executable:</w:t>
-      </w:r>
-    </w:p>
-    <w:p>
-      <w:pPr>
-        <w:spacing w:after="0"/>
-      </w:pPr>
+        <w:t>After the Sandbox finishes execution and is closed, the output file will be created in the same folder as the executable</w:t>
+      </w:r>
+      <w:r>
+        <w:t xml:space="preserve"> </w:t>
+      </w:r>
       <w:r>
         <w:t>auto_output.txt</w:t>
       </w:r>
+      <w:r>
+        <w:t xml:space="preserve">. </w:t>
+      </w:r>
+      <w:r>
+        <w:t>The file is generated automatically by the sandbox execution and does not need to be created manually.</w:t>
+      </w:r>
     </w:p>
     <w:p>
       <w:pPr>
@@ -1713,8 +1752,18 @@
     <w:p>
       <w:pPr>
         <w:pStyle w:val="Heading1"/>
-      </w:pPr>
-      <w:r>
+        <w:rPr>
+          <w:rFonts w:asciiTheme="minorHAnsi" w:hAnsiTheme="minorHAnsi"/>
+          <w:sz w:val="24"/>
+          <w:szCs w:val="24"/>
+        </w:rPr>
+      </w:pPr>
+      <w:r>
+        <w:rPr>
+          <w:rFonts w:asciiTheme="minorHAnsi" w:hAnsiTheme="minorHAnsi"/>
+          <w:sz w:val="24"/>
+          <w:szCs w:val="24"/>
+        </w:rPr>
         <w:t>4. Windows Sandbox Configuration and Policy Control</w:t>
       </w:r>
     </w:p>
@@ -2509,75 +2558,19 @@
     </w:p>
     <w:p>
       <w:pPr>
-        <w:spacing w:after="0"/>
-      </w:pPr>
-    </w:p>
-    <w:p>
-      <w:pPr>
-        <w:spacing w:after="0"/>
-      </w:pPr>
-      <w:r>
-        <w:t>This section demonstrates:</w:t>
-      </w:r>
-    </w:p>
-    <w:p>
-      <w:pPr>
-        <w:numPr>
-          <w:ilvl w:val="0"/>
-          <w:numId w:val="16"/>
-        </w:numPr>
-        <w:spacing w:after="0"/>
-      </w:pPr>
-      <w:r>
-        <w:t>Controlled execution</w:t>
-      </w:r>
-    </w:p>
-    <w:p>
-      <w:pPr>
-        <w:numPr>
-          <w:ilvl w:val="0"/>
-          <w:numId w:val="16"/>
-        </w:numPr>
-        <w:spacing w:after="0"/>
-      </w:pPr>
-      <w:r>
-        <w:t>Automated sandbox configuration</w:t>
-      </w:r>
-    </w:p>
-    <w:p>
-      <w:pPr>
-        <w:numPr>
-          <w:ilvl w:val="0"/>
-          <w:numId w:val="16"/>
-        </w:numPr>
-        <w:spacing w:after="0"/>
-      </w:pPr>
-      <w:r>
-        <w:t>Policy restriction</w:t>
-      </w:r>
-    </w:p>
-    <w:p>
-      <w:pPr>
-        <w:numPr>
-          <w:ilvl w:val="0"/>
-          <w:numId w:val="16"/>
-        </w:numPr>
-        <w:spacing w:after="0"/>
-      </w:pPr>
-      <w:r>
-        <w:t>Secure isolation</w:t>
-      </w:r>
-    </w:p>
-    <w:p>
-      <w:pPr>
-        <w:spacing w:after="0"/>
-      </w:pPr>
-    </w:p>
-    <w:p>
-      <w:pPr>
         <w:pStyle w:val="Heading1"/>
-      </w:pPr>
-      <w:r>
+        <w:rPr>
+          <w:rFonts w:asciiTheme="minorHAnsi" w:hAnsiTheme="minorHAnsi"/>
+          <w:sz w:val="24"/>
+          <w:szCs w:val="24"/>
+        </w:rPr>
+      </w:pPr>
+      <w:r>
+        <w:rPr>
+          <w:rFonts w:asciiTheme="minorHAnsi" w:hAnsiTheme="minorHAnsi"/>
+          <w:sz w:val="24"/>
+          <w:szCs w:val="24"/>
+        </w:rPr>
         <w:t>5. Testing and Verification</w:t>
       </w:r>
     </w:p>
@@ -2679,7 +2672,6 @@
         <w:spacing w:after="0"/>
       </w:pPr>
       <w:r>
-        <w:lastRenderedPageBreak/>
         <w:t>Example command:</w:t>
       </w:r>
     </w:p>
@@ -3185,14 +3177,34 @@
     <w:p>
       <w:pPr>
         <w:pStyle w:val="Heading1"/>
-      </w:pPr>
-      <w:r>
+        <w:rPr>
+          <w:rFonts w:asciiTheme="minorHAnsi" w:hAnsiTheme="minorHAnsi"/>
+          <w:sz w:val="24"/>
+          <w:szCs w:val="24"/>
+        </w:rPr>
+      </w:pPr>
+      <w:r>
+        <w:rPr>
+          <w:rFonts w:asciiTheme="minorHAnsi" w:hAnsiTheme="minorHAnsi"/>
+          <w:sz w:val="24"/>
+          <w:szCs w:val="24"/>
+        </w:rPr>
         <w:t>6. Limitations</w:t>
       </w:r>
       <w:r>
+        <w:rPr>
+          <w:rFonts w:asciiTheme="minorHAnsi" w:hAnsiTheme="minorHAnsi"/>
+          <w:sz w:val="24"/>
+          <w:szCs w:val="24"/>
+        </w:rPr>
         <w:t xml:space="preserve"> -</w:t>
       </w:r>
       <w:r>
+        <w:rPr>
+          <w:rFonts w:asciiTheme="minorHAnsi" w:hAnsiTheme="minorHAnsi"/>
+          <w:sz w:val="24"/>
+          <w:szCs w:val="24"/>
+        </w:rPr>
         <w:t xml:space="preserve"> Input Handling</w:t>
       </w:r>
     </w:p>
@@ -3268,6 +3280,606 @@
       <w:pPr>
         <w:spacing w:after="0"/>
       </w:pPr>
+    </w:p>
+    <w:p>
+      <w:pPr>
+        <w:pStyle w:val="Heading1"/>
+        <w:rPr>
+          <w:rFonts w:asciiTheme="minorHAnsi" w:hAnsiTheme="minorHAnsi"/>
+          <w:sz w:val="24"/>
+          <w:szCs w:val="24"/>
+        </w:rPr>
+      </w:pPr>
+      <w:r>
+        <w:rPr>
+          <w:rFonts w:asciiTheme="minorHAnsi" w:hAnsiTheme="minorHAnsi"/>
+          <w:sz w:val="24"/>
+          <w:szCs w:val="24"/>
+        </w:rPr>
+        <w:t>7</w:t>
+      </w:r>
+      <w:r>
+        <w:rPr>
+          <w:rFonts w:asciiTheme="minorHAnsi" w:hAnsiTheme="minorHAnsi"/>
+          <w:sz w:val="24"/>
+          <w:szCs w:val="24"/>
+        </w:rPr>
+        <w:t>. Graphical User Interface (GUI)</w:t>
+      </w:r>
+    </w:p>
+    <w:p>
+      <w:pPr>
+        <w:spacing w:after="0"/>
+      </w:pPr>
+      <w:r>
+        <w:t>The Sandbox Tool provides a graphical user interface (GUI) as an alternative method for launching and controlling sandbox execution. The GUI performs the same automation as the PowerShell script but allows the user to select inputs and configure policies through a visual interface.</w:t>
+      </w:r>
+    </w:p>
+    <w:p>
+      <w:pPr>
+        <w:spacing w:after="0"/>
+      </w:pPr>
+    </w:p>
+    <w:p>
+      <w:pPr>
+        <w:spacing w:after="0"/>
+      </w:pPr>
+    </w:p>
+    <w:p>
+      <w:pPr>
+        <w:spacing w:after="0"/>
+      </w:pPr>
+    </w:p>
+    <w:p>
+      <w:pPr>
+        <w:spacing w:after="0"/>
+      </w:pPr>
+    </w:p>
+    <w:p>
+      <w:pPr>
+        <w:spacing w:after="0"/>
+      </w:pPr>
+    </w:p>
+    <w:p>
+      <w:pPr>
+        <w:spacing w:after="0"/>
+        <w:rPr>
+          <w:b/>
+          <w:bCs/>
+        </w:rPr>
+      </w:pPr>
+      <w:r>
+        <w:rPr>
+          <w:b/>
+          <w:bCs/>
+        </w:rPr>
+        <w:lastRenderedPageBreak/>
+        <w:t>7</w:t>
+      </w:r>
+      <w:r>
+        <w:rPr>
+          <w:b/>
+          <w:bCs/>
+        </w:rPr>
+        <w:t>.1 Launching the GUI</w:t>
+      </w:r>
+    </w:p>
+    <w:p>
+      <w:pPr>
+        <w:spacing w:after="0"/>
+      </w:pPr>
+      <w:r>
+        <w:t>To start the GUI:</w:t>
+      </w:r>
+    </w:p>
+    <w:p>
+      <w:pPr>
+        <w:numPr>
+          <w:ilvl w:val="0"/>
+          <w:numId w:val="26"/>
+        </w:numPr>
+        <w:spacing w:after="0"/>
+      </w:pPr>
+      <w:r>
+        <w:t xml:space="preserve">Open </w:t>
+      </w:r>
+      <w:r>
+        <w:rPr>
+          <w:b/>
+          <w:bCs/>
+        </w:rPr>
+        <w:t>PowerShell</w:t>
+      </w:r>
+      <w:r>
+        <w:t>.</w:t>
+      </w:r>
+    </w:p>
+    <w:p>
+      <w:pPr>
+        <w:numPr>
+          <w:ilvl w:val="0"/>
+          <w:numId w:val="26"/>
+        </w:numPr>
+        <w:spacing w:after="0"/>
+      </w:pPr>
+      <w:r>
+        <w:t>Navigate to the automation folder inside the project directory.</w:t>
+      </w:r>
+    </w:p>
+    <w:p>
+      <w:pPr>
+        <w:numPr>
+          <w:ilvl w:val="0"/>
+          <w:numId w:val="26"/>
+        </w:numPr>
+        <w:spacing w:after="0"/>
+      </w:pPr>
+      <w:r>
+        <w:t>Run the following command:</w:t>
+      </w:r>
+    </w:p>
+    <w:p>
+      <w:pPr>
+        <w:spacing w:after="0"/>
+      </w:pPr>
+      <w:proofErr w:type="spellStart"/>
+      <w:r>
+        <w:t>powershell</w:t>
+      </w:r>
+      <w:proofErr w:type="spellEnd"/>
+      <w:r>
+        <w:t xml:space="preserve"> -</w:t>
+      </w:r>
+      <w:proofErr w:type="spellStart"/>
+      <w:r>
+        <w:t>ExecutionPolicy</w:t>
+      </w:r>
+      <w:proofErr w:type="spellEnd"/>
+      <w:r>
+        <w:t xml:space="preserve"> Bypass -File .\gui.ps1</w:t>
+      </w:r>
+    </w:p>
+    <w:p>
+      <w:pPr>
+        <w:spacing w:after="0"/>
+      </w:pPr>
+      <w:r>
+        <w:t xml:space="preserve">A window titled </w:t>
+      </w:r>
+      <w:r>
+        <w:rPr>
+          <w:b/>
+          <w:bCs/>
+        </w:rPr>
+        <w:t>“Sandbox Tool GUI”</w:t>
+      </w:r>
+      <w:r>
+        <w:t xml:space="preserve"> will appear.</w:t>
+      </w:r>
+    </w:p>
+    <w:p>
+      <w:pPr>
+        <w:spacing w:after="0"/>
+      </w:pPr>
+    </w:p>
+    <w:p>
+      <w:pPr>
+        <w:spacing w:after="0"/>
+        <w:rPr>
+          <w:b/>
+          <w:bCs/>
+        </w:rPr>
+      </w:pPr>
+      <w:r>
+        <w:rPr>
+          <w:b/>
+          <w:bCs/>
+        </w:rPr>
+        <w:t>7</w:t>
+      </w:r>
+      <w:r>
+        <w:rPr>
+          <w:b/>
+          <w:bCs/>
+        </w:rPr>
+        <w:t>.2 GUI Components</w:t>
+      </w:r>
+    </w:p>
+    <w:p>
+      <w:pPr>
+        <w:spacing w:after="0"/>
+      </w:pPr>
+      <w:r>
+        <w:t>The interface contains the following elements:</w:t>
+      </w:r>
+    </w:p>
+    <w:p>
+      <w:pPr>
+        <w:numPr>
+          <w:ilvl w:val="0"/>
+          <w:numId w:val="27"/>
+        </w:numPr>
+        <w:spacing w:after="0"/>
+      </w:pPr>
+      <w:r>
+        <w:rPr>
+          <w:b/>
+          <w:bCs/>
+        </w:rPr>
+        <w:t>Executable (.exe) field</w:t>
+      </w:r>
+      <w:r>
+        <w:br/>
+        <w:t>Displays the full path of the selected executable file.</w:t>
+      </w:r>
+    </w:p>
+    <w:p>
+      <w:pPr>
+        <w:numPr>
+          <w:ilvl w:val="0"/>
+          <w:numId w:val="27"/>
+        </w:numPr>
+        <w:spacing w:after="0"/>
+      </w:pPr>
+      <w:r>
+        <w:rPr>
+          <w:b/>
+          <w:bCs/>
+        </w:rPr>
+        <w:t>Browse… button</w:t>
+      </w:r>
+      <w:r>
+        <w:br/>
+        <w:t>Opens a file selection dialog allowing the user to choose the executable to be executed inside Windows Sandbox.</w:t>
+      </w:r>
+    </w:p>
+    <w:p>
+      <w:pPr>
+        <w:numPr>
+          <w:ilvl w:val="0"/>
+          <w:numId w:val="27"/>
+        </w:numPr>
+        <w:spacing w:after="0"/>
+      </w:pPr>
+      <w:r>
+        <w:rPr>
+          <w:b/>
+          <w:bCs/>
+        </w:rPr>
+        <w:t>Enable networking (checkbox)</w:t>
+      </w:r>
+      <w:r>
+        <w:br/>
+        <w:t>When selected, networking is enabled inside the sandbox environment.</w:t>
+      </w:r>
+      <w:r>
+        <w:br/>
+        <w:t>When not selected, networking is disabled.</w:t>
+      </w:r>
+      <w:r>
+        <w:br/>
+        <w:t>This directly controls the &lt;Networking&gt; policy inside the generated sandbox configuration.</w:t>
+      </w:r>
+    </w:p>
+    <w:p>
+      <w:pPr>
+        <w:numPr>
+          <w:ilvl w:val="0"/>
+          <w:numId w:val="27"/>
+        </w:numPr>
+        <w:spacing w:after="0"/>
+      </w:pPr>
+      <w:r>
+        <w:rPr>
+          <w:b/>
+          <w:bCs/>
+        </w:rPr>
+        <w:t>Run in Sandbox button</w:t>
+      </w:r>
+      <w:r>
+        <w:br/>
+        <w:t>Generates the sandbox configuration file, maps the executable folder into the sandbox, and launches Windows Sandbox automatically.</w:t>
+      </w:r>
+    </w:p>
+    <w:p>
+      <w:pPr>
+        <w:numPr>
+          <w:ilvl w:val="0"/>
+          <w:numId w:val="27"/>
+        </w:numPr>
+        <w:spacing w:after="0"/>
+      </w:pPr>
+      <w:r>
+        <w:rPr>
+          <w:b/>
+          <w:bCs/>
+        </w:rPr>
+        <w:t>Status label</w:t>
+      </w:r>
+      <w:r>
+        <w:br/>
+        <w:t>Displays execution state messages (e.g., launching sandbox, execution completed).</w:t>
+      </w:r>
+    </w:p>
+    <w:p>
+      <w:pPr>
+        <w:spacing w:after="0"/>
+      </w:pPr>
+    </w:p>
+    <w:p>
+      <w:pPr>
+        <w:spacing w:after="0"/>
+        <w:rPr>
+          <w:b/>
+          <w:bCs/>
+        </w:rPr>
+      </w:pPr>
+      <w:r>
+        <w:rPr>
+          <w:b/>
+          <w:bCs/>
+        </w:rPr>
+        <w:t>7</w:t>
+      </w:r>
+      <w:r>
+        <w:rPr>
+          <w:b/>
+          <w:bCs/>
+        </w:rPr>
+        <w:t>.3 Using the GUI</w:t>
+      </w:r>
+    </w:p>
+    <w:p>
+      <w:pPr>
+        <w:spacing w:after="0"/>
+      </w:pPr>
+      <w:r>
+        <w:t>To execute a program using the graphical interface:</w:t>
+      </w:r>
+    </w:p>
+    <w:p>
+      <w:pPr>
+        <w:numPr>
+          <w:ilvl w:val="0"/>
+          <w:numId w:val="28"/>
+        </w:numPr>
+        <w:spacing w:after="0"/>
+      </w:pPr>
+      <w:r>
+        <w:t>Launch the GUI as described in Section 5.1.</w:t>
+      </w:r>
+    </w:p>
+    <w:p>
+      <w:pPr>
+        <w:numPr>
+          <w:ilvl w:val="0"/>
+          <w:numId w:val="28"/>
+        </w:numPr>
+        <w:spacing w:after="0"/>
+      </w:pPr>
+      <w:r>
+        <w:t xml:space="preserve">Click </w:t>
+      </w:r>
+      <w:r>
+        <w:rPr>
+          <w:b/>
+          <w:bCs/>
+        </w:rPr>
+        <w:t>Browse…</w:t>
+      </w:r>
+      <w:r>
+        <w:t xml:space="preserve"> and select the executable file to test.</w:t>
+      </w:r>
+    </w:p>
+    <w:p>
+      <w:pPr>
+        <w:numPr>
+          <w:ilvl w:val="0"/>
+          <w:numId w:val="28"/>
+        </w:numPr>
+        <w:spacing w:after="0"/>
+      </w:pPr>
+      <w:r>
+        <w:t xml:space="preserve">Optionally select </w:t>
+      </w:r>
+      <w:r>
+        <w:rPr>
+          <w:b/>
+          <w:bCs/>
+        </w:rPr>
+        <w:t>Enable networking</w:t>
+      </w:r>
+      <w:r>
+        <w:t xml:space="preserve"> if network access is required.</w:t>
+      </w:r>
+    </w:p>
+    <w:p>
+      <w:pPr>
+        <w:numPr>
+          <w:ilvl w:val="0"/>
+          <w:numId w:val="28"/>
+        </w:numPr>
+        <w:spacing w:after="0"/>
+      </w:pPr>
+      <w:r>
+        <w:t xml:space="preserve">Click </w:t>
+      </w:r>
+      <w:r>
+        <w:rPr>
+          <w:b/>
+          <w:bCs/>
+        </w:rPr>
+        <w:t>Run in Sandbox</w:t>
+      </w:r>
+      <w:r>
+        <w:t>.</w:t>
+      </w:r>
+    </w:p>
+    <w:p>
+      <w:pPr>
+        <w:numPr>
+          <w:ilvl w:val="0"/>
+          <w:numId w:val="28"/>
+        </w:numPr>
+        <w:spacing w:after="0"/>
+      </w:pPr>
+      <w:r>
+        <w:t>Windows Sandbox will open automatically and execute the selected program.</w:t>
+      </w:r>
+    </w:p>
+    <w:p>
+      <w:pPr>
+        <w:numPr>
+          <w:ilvl w:val="0"/>
+          <w:numId w:val="28"/>
+        </w:numPr>
+        <w:spacing w:after="0"/>
+      </w:pPr>
+      <w:r>
+        <w:t>After execution completes, close Windows Sandbox.</w:t>
+      </w:r>
+    </w:p>
+    <w:p>
+      <w:pPr>
+        <w:numPr>
+          <w:ilvl w:val="0"/>
+          <w:numId w:val="28"/>
+        </w:numPr>
+        <w:spacing w:after="0"/>
+      </w:pPr>
+      <w:r>
+        <w:t>Locate the generated output file in the same directory as the executable.</w:t>
+      </w:r>
+    </w:p>
+    <w:p>
+      <w:pPr>
+        <w:spacing w:after="0"/>
+      </w:pPr>
+    </w:p>
+    <w:p>
+      <w:pPr>
+        <w:spacing w:after="0"/>
+        <w:rPr>
+          <w:b/>
+          <w:bCs/>
+        </w:rPr>
+      </w:pPr>
+      <w:r>
+        <w:rPr>
+          <w:b/>
+          <w:bCs/>
+        </w:rPr>
+        <w:t>7</w:t>
+      </w:r>
+      <w:r>
+        <w:rPr>
+          <w:b/>
+          <w:bCs/>
+        </w:rPr>
+        <w:t>.4 Behaviour</w:t>
+      </w:r>
+    </w:p>
+    <w:p>
+      <w:pPr>
+        <w:spacing w:after="0"/>
+      </w:pPr>
+      <w:r>
+        <w:t>When the GUI is used:</w:t>
+      </w:r>
+    </w:p>
+    <w:p>
+      <w:pPr>
+        <w:numPr>
+          <w:ilvl w:val="0"/>
+          <w:numId w:val="29"/>
+        </w:numPr>
+        <w:spacing w:after="0"/>
+      </w:pPr>
+      <w:r>
+        <w:t>A sandbox configuration file (.wsb) is generated automatically.</w:t>
+      </w:r>
+    </w:p>
+    <w:p>
+      <w:pPr>
+        <w:numPr>
+          <w:ilvl w:val="0"/>
+          <w:numId w:val="29"/>
+        </w:numPr>
+        <w:spacing w:after="0"/>
+      </w:pPr>
+      <w:r>
+        <w:t>The folder containing the selected executable is mapped into the sandbox.</w:t>
+      </w:r>
+    </w:p>
+    <w:p>
+      <w:pPr>
+        <w:numPr>
+          <w:ilvl w:val="0"/>
+          <w:numId w:val="29"/>
+        </w:numPr>
+        <w:spacing w:after="0"/>
+      </w:pPr>
+      <w:r>
+        <w:lastRenderedPageBreak/>
+        <w:t>The program is executed automatically inside the isolated environment.</w:t>
+      </w:r>
+    </w:p>
+    <w:p>
+      <w:pPr>
+        <w:numPr>
+          <w:ilvl w:val="0"/>
+          <w:numId w:val="29"/>
+        </w:numPr>
+        <w:spacing w:after="0"/>
+      </w:pPr>
+      <w:r>
+        <w:t>Output is redirected to an output file.</w:t>
+      </w:r>
+    </w:p>
+    <w:p>
+      <w:pPr>
+        <w:numPr>
+          <w:ilvl w:val="0"/>
+          <w:numId w:val="29"/>
+        </w:numPr>
+        <w:spacing w:after="0"/>
+      </w:pPr>
+      <w:r>
+        <w:t>The output file is written back to the host system in the executable directory.</w:t>
+      </w:r>
+    </w:p>
+    <w:p>
+      <w:pPr>
+        <w:numPr>
+          <w:ilvl w:val="0"/>
+          <w:numId w:val="29"/>
+        </w:numPr>
+        <w:spacing w:after="0"/>
+      </w:pPr>
+      <w:r>
+        <w:t>The networking policy is applied according to the checkbox selection.</w:t>
+      </w:r>
+    </w:p>
+    <w:p>
+      <w:pPr>
+        <w:spacing w:after="0"/>
+      </w:pPr>
+      <w:r>
+        <w:t>The GUI provides a controlled and user-friendly method for configuring and executing sandboxed program testing without manual command-line interaction.</w:t>
+      </w:r>
+    </w:p>
+    <w:p>
+      <w:pPr>
+        <w:spacing w:after="0"/>
+      </w:pPr>
+    </w:p>
+    <w:p>
+      <w:pPr>
+        <w:spacing w:after="0"/>
+      </w:pPr>
+      <w:r>
+        <w:t>The Sandbox Tool provides both command-line and graphical interfaces for executing Windows executables inside Windows Sandbox.</w:t>
+      </w:r>
     </w:p>
     <w:p>
       <w:pPr>
@@ -3585,6 +4197,155 @@
     </w:lvl>
   </w:abstractNum>
   <w:abstractNum w:abstractNumId="2" w15:restartNumberingAfterBreak="0">
+    <w:nsid w:val="02650077"/>
+    <w:multiLevelType w:val="multilevel"/>
+    <w:tmpl w:val="19B0F266"/>
+    <w:lvl w:ilvl="0">
+      <w:start w:val="1"/>
+      <w:numFmt w:val="bullet"/>
+      <w:lvlText w:val=""/>
+      <w:lvlJc w:val="left"/>
+      <w:pPr>
+        <w:tabs>
+          <w:tab w:val="num" w:pos="720"/>
+        </w:tabs>
+        <w:ind w:left="720" w:hanging="360"/>
+      </w:pPr>
+      <w:rPr>
+        <w:rFonts w:ascii="Symbol" w:hAnsi="Symbol" w:hint="default"/>
+        <w:sz w:val="20"/>
+      </w:rPr>
+    </w:lvl>
+    <w:lvl w:ilvl="1" w:tentative="1">
+      <w:start w:val="1"/>
+      <w:numFmt w:val="bullet"/>
+      <w:lvlText w:val="o"/>
+      <w:lvlJc w:val="left"/>
+      <w:pPr>
+        <w:tabs>
+          <w:tab w:val="num" w:pos="1440"/>
+        </w:tabs>
+        <w:ind w:left="1440" w:hanging="360"/>
+      </w:pPr>
+      <w:rPr>
+        <w:rFonts w:ascii="Courier New" w:hAnsi="Courier New" w:hint="default"/>
+        <w:sz w:val="20"/>
+      </w:rPr>
+    </w:lvl>
+    <w:lvl w:ilvl="2" w:tentative="1">
+      <w:start w:val="1"/>
+      <w:numFmt w:val="bullet"/>
+      <w:lvlText w:val=""/>
+      <w:lvlJc w:val="left"/>
+      <w:pPr>
+        <w:tabs>
+          <w:tab w:val="num" w:pos="2160"/>
+        </w:tabs>
+        <w:ind w:left="2160" w:hanging="360"/>
+      </w:pPr>
+      <w:rPr>
+        <w:rFonts w:ascii="Wingdings" w:hAnsi="Wingdings" w:hint="default"/>
+        <w:sz w:val="20"/>
+      </w:rPr>
+    </w:lvl>
+    <w:lvl w:ilvl="3" w:tentative="1">
+      <w:start w:val="1"/>
+      <w:numFmt w:val="bullet"/>
+      <w:lvlText w:val=""/>
+      <w:lvlJc w:val="left"/>
+      <w:pPr>
+        <w:tabs>
+          <w:tab w:val="num" w:pos="2880"/>
+        </w:tabs>
+        <w:ind w:left="2880" w:hanging="360"/>
+      </w:pPr>
+      <w:rPr>
+        <w:rFonts w:ascii="Wingdings" w:hAnsi="Wingdings" w:hint="default"/>
+        <w:sz w:val="20"/>
+      </w:rPr>
+    </w:lvl>
+    <w:lvl w:ilvl="4" w:tentative="1">
+      <w:start w:val="1"/>
+      <w:numFmt w:val="bullet"/>
+      <w:lvlText w:val=""/>
+      <w:lvlJc w:val="left"/>
+      <w:pPr>
+        <w:tabs>
+          <w:tab w:val="num" w:pos="3600"/>
+        </w:tabs>
+        <w:ind w:left="3600" w:hanging="360"/>
+      </w:pPr>
+      <w:rPr>
+        <w:rFonts w:ascii="Wingdings" w:hAnsi="Wingdings" w:hint="default"/>
+        <w:sz w:val="20"/>
+      </w:rPr>
+    </w:lvl>
+    <w:lvl w:ilvl="5" w:tentative="1">
+      <w:start w:val="1"/>
+      <w:numFmt w:val="bullet"/>
+      <w:lvlText w:val=""/>
+      <w:lvlJc w:val="left"/>
+      <w:pPr>
+        <w:tabs>
+          <w:tab w:val="num" w:pos="4320"/>
+        </w:tabs>
+        <w:ind w:left="4320" w:hanging="360"/>
+      </w:pPr>
+      <w:rPr>
+        <w:rFonts w:ascii="Wingdings" w:hAnsi="Wingdings" w:hint="default"/>
+        <w:sz w:val="20"/>
+      </w:rPr>
+    </w:lvl>
+    <w:lvl w:ilvl="6" w:tentative="1">
+      <w:start w:val="1"/>
+      <w:numFmt w:val="bullet"/>
+      <w:lvlText w:val=""/>
+      <w:lvlJc w:val="left"/>
+      <w:pPr>
+        <w:tabs>
+          <w:tab w:val="num" w:pos="5040"/>
+        </w:tabs>
+        <w:ind w:left="5040" w:hanging="360"/>
+      </w:pPr>
+      <w:rPr>
+        <w:rFonts w:ascii="Wingdings" w:hAnsi="Wingdings" w:hint="default"/>
+        <w:sz w:val="20"/>
+      </w:rPr>
+    </w:lvl>
+    <w:lvl w:ilvl="7" w:tentative="1">
+      <w:start w:val="1"/>
+      <w:numFmt w:val="bullet"/>
+      <w:lvlText w:val=""/>
+      <w:lvlJc w:val="left"/>
+      <w:pPr>
+        <w:tabs>
+          <w:tab w:val="num" w:pos="5760"/>
+        </w:tabs>
+        <w:ind w:left="5760" w:hanging="360"/>
+      </w:pPr>
+      <w:rPr>
+        <w:rFonts w:ascii="Wingdings" w:hAnsi="Wingdings" w:hint="default"/>
+        <w:sz w:val="20"/>
+      </w:rPr>
+    </w:lvl>
+    <w:lvl w:ilvl="8" w:tentative="1">
+      <w:start w:val="1"/>
+      <w:numFmt w:val="bullet"/>
+      <w:lvlText w:val=""/>
+      <w:lvlJc w:val="left"/>
+      <w:pPr>
+        <w:tabs>
+          <w:tab w:val="num" w:pos="6480"/>
+        </w:tabs>
+        <w:ind w:left="6480" w:hanging="360"/>
+      </w:pPr>
+      <w:rPr>
+        <w:rFonts w:ascii="Wingdings" w:hAnsi="Wingdings" w:hint="default"/>
+        <w:sz w:val="20"/>
+      </w:rPr>
+    </w:lvl>
+  </w:abstractNum>
+  <w:abstractNum w:abstractNumId="3" w15:restartNumberingAfterBreak="0">
     <w:nsid w:val="035E6AF6"/>
     <w:multiLevelType w:val="multilevel"/>
     <w:tmpl w:val="3BFA5F70"/>
@@ -3733,7 +4494,7 @@
       </w:rPr>
     </w:lvl>
   </w:abstractNum>
-  <w:abstractNum w:abstractNumId="3" w15:restartNumberingAfterBreak="0">
+  <w:abstractNum w:abstractNumId="4" w15:restartNumberingAfterBreak="0">
     <w:nsid w:val="071B52AD"/>
     <w:multiLevelType w:val="multilevel"/>
     <w:tmpl w:val="FCBE9CF4"/>
@@ -3846,7 +4607,7 @@
       </w:pPr>
     </w:lvl>
   </w:abstractNum>
-  <w:abstractNum w:abstractNumId="4" w15:restartNumberingAfterBreak="0">
+  <w:abstractNum w:abstractNumId="5" w15:restartNumberingAfterBreak="0">
     <w:nsid w:val="10C6333C"/>
     <w:multiLevelType w:val="multilevel"/>
     <w:tmpl w:val="958CACAA"/>
@@ -3995,7 +4756,120 @@
       </w:rPr>
     </w:lvl>
   </w:abstractNum>
-  <w:abstractNum w:abstractNumId="5" w15:restartNumberingAfterBreak="0">
+  <w:abstractNum w:abstractNumId="6" w15:restartNumberingAfterBreak="0">
+    <w:nsid w:val="18077C9B"/>
+    <w:multiLevelType w:val="multilevel"/>
+    <w:tmpl w:val="18328BBC"/>
+    <w:lvl w:ilvl="0">
+      <w:start w:val="1"/>
+      <w:numFmt w:val="decimal"/>
+      <w:lvlText w:val="%1."/>
+      <w:lvlJc w:val="left"/>
+      <w:pPr>
+        <w:tabs>
+          <w:tab w:val="num" w:pos="720"/>
+        </w:tabs>
+        <w:ind w:left="720" w:hanging="360"/>
+      </w:pPr>
+    </w:lvl>
+    <w:lvl w:ilvl="1" w:tentative="1">
+      <w:start w:val="1"/>
+      <w:numFmt w:val="decimal"/>
+      <w:lvlText w:val="%2."/>
+      <w:lvlJc w:val="left"/>
+      <w:pPr>
+        <w:tabs>
+          <w:tab w:val="num" w:pos="1440"/>
+        </w:tabs>
+        <w:ind w:left="1440" w:hanging="360"/>
+      </w:pPr>
+    </w:lvl>
+    <w:lvl w:ilvl="2" w:tentative="1">
+      <w:start w:val="1"/>
+      <w:numFmt w:val="decimal"/>
+      <w:lvlText w:val="%3."/>
+      <w:lvlJc w:val="left"/>
+      <w:pPr>
+        <w:tabs>
+          <w:tab w:val="num" w:pos="2160"/>
+        </w:tabs>
+        <w:ind w:left="2160" w:hanging="360"/>
+      </w:pPr>
+    </w:lvl>
+    <w:lvl w:ilvl="3" w:tentative="1">
+      <w:start w:val="1"/>
+      <w:numFmt w:val="decimal"/>
+      <w:lvlText w:val="%4."/>
+      <w:lvlJc w:val="left"/>
+      <w:pPr>
+        <w:tabs>
+          <w:tab w:val="num" w:pos="2880"/>
+        </w:tabs>
+        <w:ind w:left="2880" w:hanging="360"/>
+      </w:pPr>
+    </w:lvl>
+    <w:lvl w:ilvl="4" w:tentative="1">
+      <w:start w:val="1"/>
+      <w:numFmt w:val="decimal"/>
+      <w:lvlText w:val="%5."/>
+      <w:lvlJc w:val="left"/>
+      <w:pPr>
+        <w:tabs>
+          <w:tab w:val="num" w:pos="3600"/>
+        </w:tabs>
+        <w:ind w:left="3600" w:hanging="360"/>
+      </w:pPr>
+    </w:lvl>
+    <w:lvl w:ilvl="5" w:tentative="1">
+      <w:start w:val="1"/>
+      <w:numFmt w:val="decimal"/>
+      <w:lvlText w:val="%6."/>
+      <w:lvlJc w:val="left"/>
+      <w:pPr>
+        <w:tabs>
+          <w:tab w:val="num" w:pos="4320"/>
+        </w:tabs>
+        <w:ind w:left="4320" w:hanging="360"/>
+      </w:pPr>
+    </w:lvl>
+    <w:lvl w:ilvl="6" w:tentative="1">
+      <w:start w:val="1"/>
+      <w:numFmt w:val="decimal"/>
+      <w:lvlText w:val="%7."/>
+      <w:lvlJc w:val="left"/>
+      <w:pPr>
+        <w:tabs>
+          <w:tab w:val="num" w:pos="5040"/>
+        </w:tabs>
+        <w:ind w:left="5040" w:hanging="360"/>
+      </w:pPr>
+    </w:lvl>
+    <w:lvl w:ilvl="7" w:tentative="1">
+      <w:start w:val="1"/>
+      <w:numFmt w:val="decimal"/>
+      <w:lvlText w:val="%8."/>
+      <w:lvlJc w:val="left"/>
+      <w:pPr>
+        <w:tabs>
+          <w:tab w:val="num" w:pos="5760"/>
+        </w:tabs>
+        <w:ind w:left="5760" w:hanging="360"/>
+      </w:pPr>
+    </w:lvl>
+    <w:lvl w:ilvl="8" w:tentative="1">
+      <w:start w:val="1"/>
+      <w:numFmt w:val="decimal"/>
+      <w:lvlText w:val="%9."/>
+      <w:lvlJc w:val="left"/>
+      <w:pPr>
+        <w:tabs>
+          <w:tab w:val="num" w:pos="6480"/>
+        </w:tabs>
+        <w:ind w:left="6480" w:hanging="360"/>
+      </w:pPr>
+    </w:lvl>
+  </w:abstractNum>
+  <w:abstractNum w:abstractNumId="7" w15:restartNumberingAfterBreak="0">
     <w:nsid w:val="18372559"/>
     <w:multiLevelType w:val="multilevel"/>
     <w:tmpl w:val="E5A44538"/>
@@ -4144,7 +5018,7 @@
       </w:rPr>
     </w:lvl>
   </w:abstractNum>
-  <w:abstractNum w:abstractNumId="6" w15:restartNumberingAfterBreak="0">
+  <w:abstractNum w:abstractNumId="8" w15:restartNumberingAfterBreak="0">
     <w:nsid w:val="1DB73931"/>
     <w:multiLevelType w:val="multilevel"/>
     <w:tmpl w:val="F306CDBA"/>
@@ -4293,7 +5167,269 @@
       </w:rPr>
     </w:lvl>
   </w:abstractNum>
-  <w:abstractNum w:abstractNumId="7" w15:restartNumberingAfterBreak="0">
+  <w:abstractNum w:abstractNumId="9" w15:restartNumberingAfterBreak="0">
+    <w:nsid w:val="1F147A76"/>
+    <w:multiLevelType w:val="multilevel"/>
+    <w:tmpl w:val="98625A4C"/>
+    <w:lvl w:ilvl="0">
+      <w:start w:val="1"/>
+      <w:numFmt w:val="bullet"/>
+      <w:lvlText w:val=""/>
+      <w:lvlJc w:val="left"/>
+      <w:pPr>
+        <w:tabs>
+          <w:tab w:val="num" w:pos="720"/>
+        </w:tabs>
+        <w:ind w:left="720" w:hanging="360"/>
+      </w:pPr>
+      <w:rPr>
+        <w:rFonts w:ascii="Symbol" w:hAnsi="Symbol" w:hint="default"/>
+        <w:sz w:val="20"/>
+      </w:rPr>
+    </w:lvl>
+    <w:lvl w:ilvl="1" w:tentative="1">
+      <w:start w:val="1"/>
+      <w:numFmt w:val="bullet"/>
+      <w:lvlText w:val="o"/>
+      <w:lvlJc w:val="left"/>
+      <w:pPr>
+        <w:tabs>
+          <w:tab w:val="num" w:pos="1440"/>
+        </w:tabs>
+        <w:ind w:left="1440" w:hanging="360"/>
+      </w:pPr>
+      <w:rPr>
+        <w:rFonts w:ascii="Courier New" w:hAnsi="Courier New" w:hint="default"/>
+        <w:sz w:val="20"/>
+      </w:rPr>
+    </w:lvl>
+    <w:lvl w:ilvl="2" w:tentative="1">
+      <w:start w:val="1"/>
+      <w:numFmt w:val="bullet"/>
+      <w:lvlText w:val=""/>
+      <w:lvlJc w:val="left"/>
+      <w:pPr>
+        <w:tabs>
+          <w:tab w:val="num" w:pos="2160"/>
+        </w:tabs>
+        <w:ind w:left="2160" w:hanging="360"/>
+      </w:pPr>
+      <w:rPr>
+        <w:rFonts w:ascii="Wingdings" w:hAnsi="Wingdings" w:hint="default"/>
+        <w:sz w:val="20"/>
+      </w:rPr>
+    </w:lvl>
+    <w:lvl w:ilvl="3" w:tentative="1">
+      <w:start w:val="1"/>
+      <w:numFmt w:val="bullet"/>
+      <w:lvlText w:val=""/>
+      <w:lvlJc w:val="left"/>
+      <w:pPr>
+        <w:tabs>
+          <w:tab w:val="num" w:pos="2880"/>
+        </w:tabs>
+        <w:ind w:left="2880" w:hanging="360"/>
+      </w:pPr>
+      <w:rPr>
+        <w:rFonts w:ascii="Wingdings" w:hAnsi="Wingdings" w:hint="default"/>
+        <w:sz w:val="20"/>
+      </w:rPr>
+    </w:lvl>
+    <w:lvl w:ilvl="4" w:tentative="1">
+      <w:start w:val="1"/>
+      <w:numFmt w:val="bullet"/>
+      <w:lvlText w:val=""/>
+      <w:lvlJc w:val="left"/>
+      <w:pPr>
+        <w:tabs>
+          <w:tab w:val="num" w:pos="3600"/>
+        </w:tabs>
+        <w:ind w:left="3600" w:hanging="360"/>
+      </w:pPr>
+      <w:rPr>
+        <w:rFonts w:ascii="Wingdings" w:hAnsi="Wingdings" w:hint="default"/>
+        <w:sz w:val="20"/>
+      </w:rPr>
+    </w:lvl>
+    <w:lvl w:ilvl="5" w:tentative="1">
+      <w:start w:val="1"/>
+      <w:numFmt w:val="bullet"/>
+      <w:lvlText w:val=""/>
+      <w:lvlJc w:val="left"/>
+      <w:pPr>
+        <w:tabs>
+          <w:tab w:val="num" w:pos="4320"/>
+        </w:tabs>
+        <w:ind w:left="4320" w:hanging="360"/>
+      </w:pPr>
+      <w:rPr>
+        <w:rFonts w:ascii="Wingdings" w:hAnsi="Wingdings" w:hint="default"/>
+        <w:sz w:val="20"/>
+      </w:rPr>
+    </w:lvl>
+    <w:lvl w:ilvl="6" w:tentative="1">
+      <w:start w:val="1"/>
+      <w:numFmt w:val="bullet"/>
+      <w:lvlText w:val=""/>
+      <w:lvlJc w:val="left"/>
+      <w:pPr>
+        <w:tabs>
+          <w:tab w:val="num" w:pos="5040"/>
+        </w:tabs>
+        <w:ind w:left="5040" w:hanging="360"/>
+      </w:pPr>
+      <w:rPr>
+        <w:rFonts w:ascii="Wingdings" w:hAnsi="Wingdings" w:hint="default"/>
+        <w:sz w:val="20"/>
+      </w:rPr>
+    </w:lvl>
+    <w:lvl w:ilvl="7" w:tentative="1">
+      <w:start w:val="1"/>
+      <w:numFmt w:val="bullet"/>
+      <w:lvlText w:val=""/>
+      <w:lvlJc w:val="left"/>
+      <w:pPr>
+        <w:tabs>
+          <w:tab w:val="num" w:pos="5760"/>
+        </w:tabs>
+        <w:ind w:left="5760" w:hanging="360"/>
+      </w:pPr>
+      <w:rPr>
+        <w:rFonts w:ascii="Wingdings" w:hAnsi="Wingdings" w:hint="default"/>
+        <w:sz w:val="20"/>
+      </w:rPr>
+    </w:lvl>
+    <w:lvl w:ilvl="8" w:tentative="1">
+      <w:start w:val="1"/>
+      <w:numFmt w:val="bullet"/>
+      <w:lvlText w:val=""/>
+      <w:lvlJc w:val="left"/>
+      <w:pPr>
+        <w:tabs>
+          <w:tab w:val="num" w:pos="6480"/>
+        </w:tabs>
+        <w:ind w:left="6480" w:hanging="360"/>
+      </w:pPr>
+      <w:rPr>
+        <w:rFonts w:ascii="Wingdings" w:hAnsi="Wingdings" w:hint="default"/>
+        <w:sz w:val="20"/>
+      </w:rPr>
+    </w:lvl>
+  </w:abstractNum>
+  <w:abstractNum w:abstractNumId="10" w15:restartNumberingAfterBreak="0">
+    <w:nsid w:val="2A716CC7"/>
+    <w:multiLevelType w:val="multilevel"/>
+    <w:tmpl w:val="BADAC548"/>
+    <w:lvl w:ilvl="0">
+      <w:start w:val="1"/>
+      <w:numFmt w:val="decimal"/>
+      <w:lvlText w:val="%1."/>
+      <w:lvlJc w:val="left"/>
+      <w:pPr>
+        <w:tabs>
+          <w:tab w:val="num" w:pos="720"/>
+        </w:tabs>
+        <w:ind w:left="720" w:hanging="360"/>
+      </w:pPr>
+    </w:lvl>
+    <w:lvl w:ilvl="1" w:tentative="1">
+      <w:start w:val="1"/>
+      <w:numFmt w:val="decimal"/>
+      <w:lvlText w:val="%2."/>
+      <w:lvlJc w:val="left"/>
+      <w:pPr>
+        <w:tabs>
+          <w:tab w:val="num" w:pos="1440"/>
+        </w:tabs>
+        <w:ind w:left="1440" w:hanging="360"/>
+      </w:pPr>
+    </w:lvl>
+    <w:lvl w:ilvl="2" w:tentative="1">
+      <w:start w:val="1"/>
+      <w:numFmt w:val="decimal"/>
+      <w:lvlText w:val="%3."/>
+      <w:lvlJc w:val="left"/>
+      <w:pPr>
+        <w:tabs>
+          <w:tab w:val="num" w:pos="2160"/>
+        </w:tabs>
+        <w:ind w:left="2160" w:hanging="360"/>
+      </w:pPr>
+    </w:lvl>
+    <w:lvl w:ilvl="3" w:tentative="1">
+      <w:start w:val="1"/>
+      <w:numFmt w:val="decimal"/>
+      <w:lvlText w:val="%4."/>
+      <w:lvlJc w:val="left"/>
+      <w:pPr>
+        <w:tabs>
+          <w:tab w:val="num" w:pos="2880"/>
+        </w:tabs>
+        <w:ind w:left="2880" w:hanging="360"/>
+      </w:pPr>
+    </w:lvl>
+    <w:lvl w:ilvl="4" w:tentative="1">
+      <w:start w:val="1"/>
+      <w:numFmt w:val="decimal"/>
+      <w:lvlText w:val="%5."/>
+      <w:lvlJc w:val="left"/>
+      <w:pPr>
+        <w:tabs>
+          <w:tab w:val="num" w:pos="3600"/>
+        </w:tabs>
+        <w:ind w:left="3600" w:hanging="360"/>
+      </w:pPr>
+    </w:lvl>
+    <w:lvl w:ilvl="5" w:tentative="1">
+      <w:start w:val="1"/>
+      <w:numFmt w:val="decimal"/>
+      <w:lvlText w:val="%6."/>
+      <w:lvlJc w:val="left"/>
+      <w:pPr>
+        <w:tabs>
+          <w:tab w:val="num" w:pos="4320"/>
+        </w:tabs>
+        <w:ind w:left="4320" w:hanging="360"/>
+      </w:pPr>
+    </w:lvl>
+    <w:lvl w:ilvl="6" w:tentative="1">
+      <w:start w:val="1"/>
+      <w:numFmt w:val="decimal"/>
+      <w:lvlText w:val="%7."/>
+      <w:lvlJc w:val="left"/>
+      <w:pPr>
+        <w:tabs>
+          <w:tab w:val="num" w:pos="5040"/>
+        </w:tabs>
+        <w:ind w:left="5040" w:hanging="360"/>
+      </w:pPr>
+    </w:lvl>
+    <w:lvl w:ilvl="7" w:tentative="1">
+      <w:start w:val="1"/>
+      <w:numFmt w:val="decimal"/>
+      <w:lvlText w:val="%8."/>
+      <w:lvlJc w:val="left"/>
+      <w:pPr>
+        <w:tabs>
+          <w:tab w:val="num" w:pos="5760"/>
+        </w:tabs>
+        <w:ind w:left="5760" w:hanging="360"/>
+      </w:pPr>
+    </w:lvl>
+    <w:lvl w:ilvl="8" w:tentative="1">
+      <w:start w:val="1"/>
+      <w:numFmt w:val="decimal"/>
+      <w:lvlText w:val="%9."/>
+      <w:lvlJc w:val="left"/>
+      <w:pPr>
+        <w:tabs>
+          <w:tab w:val="num" w:pos="6480"/>
+        </w:tabs>
+        <w:ind w:left="6480" w:hanging="360"/>
+      </w:pPr>
+    </w:lvl>
+  </w:abstractNum>
+  <w:abstractNum w:abstractNumId="11" w15:restartNumberingAfterBreak="0">
     <w:nsid w:val="2C8F2A42"/>
     <w:multiLevelType w:val="multilevel"/>
     <w:tmpl w:val="E272AE16"/>
@@ -4442,7 +5578,7 @@
       </w:rPr>
     </w:lvl>
   </w:abstractNum>
-  <w:abstractNum w:abstractNumId="8" w15:restartNumberingAfterBreak="0">
+  <w:abstractNum w:abstractNumId="12" w15:restartNumberingAfterBreak="0">
     <w:nsid w:val="30992836"/>
     <w:multiLevelType w:val="multilevel"/>
     <w:tmpl w:val="D518831C"/>
@@ -4591,7 +5727,7 @@
       </w:rPr>
     </w:lvl>
   </w:abstractNum>
-  <w:abstractNum w:abstractNumId="9" w15:restartNumberingAfterBreak="0">
+  <w:abstractNum w:abstractNumId="13" w15:restartNumberingAfterBreak="0">
     <w:nsid w:val="3AF05730"/>
     <w:multiLevelType w:val="multilevel"/>
     <w:tmpl w:val="23886F66"/>
@@ -4740,7 +5876,7 @@
       </w:rPr>
     </w:lvl>
   </w:abstractNum>
-  <w:abstractNum w:abstractNumId="10" w15:restartNumberingAfterBreak="0">
+  <w:abstractNum w:abstractNumId="14" w15:restartNumberingAfterBreak="0">
     <w:nsid w:val="417E2FBE"/>
     <w:multiLevelType w:val="multilevel"/>
     <w:tmpl w:val="8EFA8D50"/>
@@ -4889,7 +6025,7 @@
       </w:rPr>
     </w:lvl>
   </w:abstractNum>
-  <w:abstractNum w:abstractNumId="11" w15:restartNumberingAfterBreak="0">
+  <w:abstractNum w:abstractNumId="15" w15:restartNumberingAfterBreak="0">
     <w:nsid w:val="464C1C95"/>
     <w:multiLevelType w:val="multilevel"/>
     <w:tmpl w:val="8A6017FA"/>
@@ -5038,7 +6174,7 @@
       </w:rPr>
     </w:lvl>
   </w:abstractNum>
-  <w:abstractNum w:abstractNumId="12" w15:restartNumberingAfterBreak="0">
+  <w:abstractNum w:abstractNumId="16" w15:restartNumberingAfterBreak="0">
     <w:nsid w:val="4B1F185D"/>
     <w:multiLevelType w:val="multilevel"/>
     <w:tmpl w:val="D47411D2"/>
@@ -5151,7 +6287,7 @@
       </w:pPr>
     </w:lvl>
   </w:abstractNum>
-  <w:abstractNum w:abstractNumId="13" w15:restartNumberingAfterBreak="0">
+  <w:abstractNum w:abstractNumId="17" w15:restartNumberingAfterBreak="0">
     <w:nsid w:val="4B9F66D3"/>
     <w:multiLevelType w:val="multilevel"/>
     <w:tmpl w:val="04823E68"/>
@@ -5300,7 +6436,7 @@
       </w:rPr>
     </w:lvl>
   </w:abstractNum>
-  <w:abstractNum w:abstractNumId="14" w15:restartNumberingAfterBreak="0">
+  <w:abstractNum w:abstractNumId="18" w15:restartNumberingAfterBreak="0">
     <w:nsid w:val="4BB061D0"/>
     <w:multiLevelType w:val="multilevel"/>
     <w:tmpl w:val="58F2A222"/>
@@ -5449,7 +6585,7 @@
       </w:rPr>
     </w:lvl>
   </w:abstractNum>
-  <w:abstractNum w:abstractNumId="15" w15:restartNumberingAfterBreak="0">
+  <w:abstractNum w:abstractNumId="19" w15:restartNumberingAfterBreak="0">
     <w:nsid w:val="4DAC13AB"/>
     <w:multiLevelType w:val="multilevel"/>
     <w:tmpl w:val="79B211B2"/>
@@ -5598,7 +6734,7 @@
       </w:rPr>
     </w:lvl>
   </w:abstractNum>
-  <w:abstractNum w:abstractNumId="16" w15:restartNumberingAfterBreak="0">
+  <w:abstractNum w:abstractNumId="20" w15:restartNumberingAfterBreak="0">
     <w:nsid w:val="54574DB1"/>
     <w:multiLevelType w:val="multilevel"/>
     <w:tmpl w:val="91D29D18"/>
@@ -5747,7 +6883,7 @@
       </w:rPr>
     </w:lvl>
   </w:abstractNum>
-  <w:abstractNum w:abstractNumId="17" w15:restartNumberingAfterBreak="0">
+  <w:abstractNum w:abstractNumId="21" w15:restartNumberingAfterBreak="0">
     <w:nsid w:val="54AC0958"/>
     <w:multiLevelType w:val="multilevel"/>
     <w:tmpl w:val="6B729180"/>
@@ -5896,7 +7032,7 @@
       </w:rPr>
     </w:lvl>
   </w:abstractNum>
-  <w:abstractNum w:abstractNumId="18" w15:restartNumberingAfterBreak="0">
+  <w:abstractNum w:abstractNumId="22" w15:restartNumberingAfterBreak="0">
     <w:nsid w:val="5E97098C"/>
     <w:multiLevelType w:val="multilevel"/>
     <w:tmpl w:val="FD9C03E8"/>
@@ -6009,7 +7145,7 @@
       </w:pPr>
     </w:lvl>
   </w:abstractNum>
-  <w:abstractNum w:abstractNumId="19" w15:restartNumberingAfterBreak="0">
+  <w:abstractNum w:abstractNumId="23" w15:restartNumberingAfterBreak="0">
     <w:nsid w:val="64AD0118"/>
     <w:multiLevelType w:val="multilevel"/>
     <w:tmpl w:val="38BCF6E4"/>
@@ -6158,7 +7294,7 @@
       </w:rPr>
     </w:lvl>
   </w:abstractNum>
-  <w:abstractNum w:abstractNumId="20" w15:restartNumberingAfterBreak="0">
+  <w:abstractNum w:abstractNumId="24" w15:restartNumberingAfterBreak="0">
     <w:nsid w:val="6DB3423C"/>
     <w:multiLevelType w:val="multilevel"/>
     <w:tmpl w:val="83C81DE4"/>
@@ -6271,7 +7407,7 @@
       </w:pPr>
     </w:lvl>
   </w:abstractNum>
-  <w:abstractNum w:abstractNumId="21" w15:restartNumberingAfterBreak="0">
+  <w:abstractNum w:abstractNumId="25" w15:restartNumberingAfterBreak="0">
     <w:nsid w:val="72090A3D"/>
     <w:multiLevelType w:val="multilevel"/>
     <w:tmpl w:val="F53A7678"/>
@@ -6420,7 +7556,7 @@
       </w:rPr>
     </w:lvl>
   </w:abstractNum>
-  <w:abstractNum w:abstractNumId="22" w15:restartNumberingAfterBreak="0">
+  <w:abstractNum w:abstractNumId="26" w15:restartNumberingAfterBreak="0">
     <w:nsid w:val="742744EF"/>
     <w:multiLevelType w:val="multilevel"/>
     <w:tmpl w:val="9C888308"/>
@@ -6569,7 +7705,7 @@
       </w:rPr>
     </w:lvl>
   </w:abstractNum>
-  <w:abstractNum w:abstractNumId="23" w15:restartNumberingAfterBreak="0">
+  <w:abstractNum w:abstractNumId="27" w15:restartNumberingAfterBreak="0">
     <w:nsid w:val="76294B99"/>
     <w:multiLevelType w:val="multilevel"/>
     <w:tmpl w:val="DFF42708"/>
@@ -6682,7 +7818,7 @@
       </w:pPr>
     </w:lvl>
   </w:abstractNum>
-  <w:abstractNum w:abstractNumId="24" w15:restartNumberingAfterBreak="0">
+  <w:abstractNum w:abstractNumId="28" w15:restartNumberingAfterBreak="0">
     <w:nsid w:val="7BD03B52"/>
     <w:multiLevelType w:val="multilevel"/>
     <w:tmpl w:val="160AE334"/>
@@ -6832,79 +7968,91 @@
     </w:lvl>
   </w:abstractNum>
   <w:num w:numId="1" w16cid:durableId="1770159858">
-    <w:abstractNumId w:val="6"/>
+    <w:abstractNumId w:val="8"/>
   </w:num>
   <w:num w:numId="2" w16cid:durableId="687407528">
-    <w:abstractNumId w:val="15"/>
+    <w:abstractNumId w:val="19"/>
   </w:num>
   <w:num w:numId="3" w16cid:durableId="418452408">
+    <w:abstractNumId w:val="11"/>
+  </w:num>
+  <w:num w:numId="4" w16cid:durableId="532882388">
+    <w:abstractNumId w:val="13"/>
+  </w:num>
+  <w:num w:numId="5" w16cid:durableId="116488410">
+    <w:abstractNumId w:val="24"/>
+  </w:num>
+  <w:num w:numId="6" w16cid:durableId="1806702954">
     <w:abstractNumId w:val="7"/>
   </w:num>
-  <w:num w:numId="4" w16cid:durableId="532882388">
-    <w:abstractNumId w:val="9"/>
+  <w:num w:numId="7" w16cid:durableId="695082598">
+    <w:abstractNumId w:val="12"/>
   </w:num>
-  <w:num w:numId="5" w16cid:durableId="116488410">
+  <w:num w:numId="8" w16cid:durableId="384791969">
     <w:abstractNumId w:val="20"/>
   </w:num>
-  <w:num w:numId="6" w16cid:durableId="1806702954">
-    <w:abstractNumId w:val="5"/>
+  <w:num w:numId="9" w16cid:durableId="1929342419">
+    <w:abstractNumId w:val="3"/>
   </w:num>
-  <w:num w:numId="7" w16cid:durableId="695082598">
-    <w:abstractNumId w:val="8"/>
+  <w:num w:numId="10" w16cid:durableId="1818716450">
+    <w:abstractNumId w:val="4"/>
   </w:num>
-  <w:num w:numId="8" w16cid:durableId="384791969">
+  <w:num w:numId="11" w16cid:durableId="608852128">
+    <w:abstractNumId w:val="22"/>
+  </w:num>
+  <w:num w:numId="12" w16cid:durableId="1940793749">
     <w:abstractNumId w:val="16"/>
   </w:num>
-  <w:num w:numId="9" w16cid:durableId="1929342419">
-    <w:abstractNumId w:val="2"/>
-  </w:num>
-  <w:num w:numId="10" w16cid:durableId="1818716450">
-    <w:abstractNumId w:val="3"/>
-  </w:num>
-  <w:num w:numId="11" w16cid:durableId="608852128">
+  <w:num w:numId="13" w16cid:durableId="1059674287">
     <w:abstractNumId w:val="18"/>
   </w:num>
-  <w:num w:numId="12" w16cid:durableId="1940793749">
-    <w:abstractNumId w:val="12"/>
-  </w:num>
-  <w:num w:numId="13" w16cid:durableId="1059674287">
-    <w:abstractNumId w:val="14"/>
-  </w:num>
   <w:num w:numId="14" w16cid:durableId="491407474">
-    <w:abstractNumId w:val="22"/>
+    <w:abstractNumId w:val="26"/>
   </w:num>
   <w:num w:numId="15" w16cid:durableId="1243025268">
-    <w:abstractNumId w:val="4"/>
+    <w:abstractNumId w:val="5"/>
   </w:num>
   <w:num w:numId="16" w16cid:durableId="525481321">
     <w:abstractNumId w:val="1"/>
   </w:num>
   <w:num w:numId="17" w16cid:durableId="1634671453">
-    <w:abstractNumId w:val="10"/>
+    <w:abstractNumId w:val="14"/>
   </w:num>
   <w:num w:numId="18" w16cid:durableId="433524598">
-    <w:abstractNumId w:val="19"/>
+    <w:abstractNumId w:val="23"/>
   </w:num>
   <w:num w:numId="19" w16cid:durableId="1317420642">
-    <w:abstractNumId w:val="13"/>
+    <w:abstractNumId w:val="17"/>
   </w:num>
   <w:num w:numId="20" w16cid:durableId="1521240168">
-    <w:abstractNumId w:val="23"/>
+    <w:abstractNumId w:val="27"/>
   </w:num>
   <w:num w:numId="21" w16cid:durableId="1737046328">
-    <w:abstractNumId w:val="24"/>
+    <w:abstractNumId w:val="28"/>
   </w:num>
   <w:num w:numId="22" w16cid:durableId="576209330">
-    <w:abstractNumId w:val="11"/>
+    <w:abstractNumId w:val="15"/>
   </w:num>
   <w:num w:numId="23" w16cid:durableId="623462798">
-    <w:abstractNumId w:val="17"/>
+    <w:abstractNumId w:val="21"/>
   </w:num>
   <w:num w:numId="24" w16cid:durableId="54402626">
     <w:abstractNumId w:val="0"/>
   </w:num>
   <w:num w:numId="25" w16cid:durableId="462650825">
-    <w:abstractNumId w:val="21"/>
+    <w:abstractNumId w:val="25"/>
+  </w:num>
+  <w:num w:numId="26" w16cid:durableId="614026081">
+    <w:abstractNumId w:val="6"/>
+  </w:num>
+  <w:num w:numId="27" w16cid:durableId="1522165834">
+    <w:abstractNumId w:val="2"/>
+  </w:num>
+  <w:num w:numId="28" w16cid:durableId="2896836">
+    <w:abstractNumId w:val="10"/>
+  </w:num>
+  <w:num w:numId="29" w16cid:durableId="1294798044">
+    <w:abstractNumId w:val="9"/>
   </w:num>
 </w:numbering>
 </file>

</xml_diff>